<commit_message>
Added Sql code for creating database and tables to the plan document
</commit_message>
<xml_diff>
--- a/Documents/Race Day Plan.docx
+++ b/Documents/Race Day Plan.docx
@@ -1823,6 +1823,795 @@
       </w:tr>
     </w:tbl>
     <w:p/>
+    <w:p>
+      <w:pPr>
+        <w:pStyle w:val="Heading1"/>
+      </w:pPr>
+      <w:r>
+        <w:t>Section C – SQL Database Script</w:t>
+      </w:r>
+    </w:p>
+    <w:p>
+      <w:r>
+        <w:t xml:space="preserve">create database </w:t>
+      </w:r>
+      <w:proofErr w:type="spellStart"/>
+      <w:r>
+        <w:t>RaceDay</w:t>
+      </w:r>
+      <w:proofErr w:type="spellEnd"/>
+      <w:r>
+        <w:t>;</w:t>
+      </w:r>
+    </w:p>
+    <w:p>
+      <w:r>
+        <w:t xml:space="preserve">use </w:t>
+      </w:r>
+      <w:proofErr w:type="spellStart"/>
+      <w:r>
+        <w:t>RaceDay</w:t>
+      </w:r>
+      <w:proofErr w:type="spellEnd"/>
+      <w:r>
+        <w:t>;</w:t>
+      </w:r>
+    </w:p>
+    <w:p>
+      <w:r>
+        <w:t xml:space="preserve">create table </w:t>
+      </w:r>
+      <w:proofErr w:type="gramStart"/>
+      <w:r>
+        <w:t>Users(</w:t>
+      </w:r>
+      <w:proofErr w:type="gramEnd"/>
+    </w:p>
+    <w:p>
+      <w:r>
+        <w:tab/>
+      </w:r>
+      <w:proofErr w:type="spellStart"/>
+      <w:r>
+        <w:t>userId</w:t>
+      </w:r>
+      <w:proofErr w:type="spellEnd"/>
+      <w:r>
+        <w:t xml:space="preserve"> int </w:t>
+      </w:r>
+      <w:proofErr w:type="gramStart"/>
+      <w:r>
+        <w:t>identity(</w:t>
+      </w:r>
+      <w:proofErr w:type="gramEnd"/>
+      <w:r>
+        <w:t>1000, 1) primary key,</w:t>
+      </w:r>
+    </w:p>
+    <w:p>
+      <w:r>
+        <w:tab/>
+      </w:r>
+      <w:proofErr w:type="spellStart"/>
+      <w:r>
+        <w:t>firstName</w:t>
+      </w:r>
+      <w:proofErr w:type="spellEnd"/>
+      <w:r>
+        <w:t xml:space="preserve"> </w:t>
+      </w:r>
+      <w:proofErr w:type="gramStart"/>
+      <w:r>
+        <w:t>varchar(</w:t>
+      </w:r>
+      <w:proofErr w:type="gramEnd"/>
+      <w:r>
+        <w:t>50) not null,</w:t>
+      </w:r>
+    </w:p>
+    <w:p>
+      <w:r>
+        <w:tab/>
+      </w:r>
+      <w:proofErr w:type="spellStart"/>
+      <w:r>
+        <w:t>lastName</w:t>
+      </w:r>
+      <w:proofErr w:type="spellEnd"/>
+      <w:r>
+        <w:t xml:space="preserve"> </w:t>
+      </w:r>
+      <w:proofErr w:type="gramStart"/>
+      <w:r>
+        <w:t>varchar(</w:t>
+      </w:r>
+      <w:proofErr w:type="gramEnd"/>
+      <w:r>
+        <w:t>50) not null,</w:t>
+      </w:r>
+    </w:p>
+    <w:p>
+      <w:r>
+        <w:tab/>
+      </w:r>
+      <w:proofErr w:type="spellStart"/>
+      <w:r>
+        <w:t>emailAddress</w:t>
+      </w:r>
+      <w:proofErr w:type="spellEnd"/>
+      <w:r>
+        <w:t xml:space="preserve"> </w:t>
+      </w:r>
+      <w:proofErr w:type="gramStart"/>
+      <w:r>
+        <w:t>varchar(</w:t>
+      </w:r>
+      <w:proofErr w:type="gramEnd"/>
+      <w:r>
+        <w:t>100) not null,</w:t>
+      </w:r>
+    </w:p>
+    <w:p>
+      <w:r>
+        <w:tab/>
+        <w:t xml:space="preserve">password </w:t>
+      </w:r>
+      <w:proofErr w:type="gramStart"/>
+      <w:r>
+        <w:t>varchar(</w:t>
+      </w:r>
+      <w:proofErr w:type="gramEnd"/>
+      <w:r>
+        <w:t>100),</w:t>
+      </w:r>
+    </w:p>
+    <w:p>
+      <w:r>
+        <w:tab/>
+        <w:t xml:space="preserve">username </w:t>
+      </w:r>
+      <w:proofErr w:type="gramStart"/>
+      <w:r>
+        <w:t>varchar(</w:t>
+      </w:r>
+      <w:proofErr w:type="gramEnd"/>
+      <w:r>
+        <w:t>50),</w:t>
+      </w:r>
+    </w:p>
+    <w:p>
+      <w:r>
+        <w:tab/>
+        <w:t xml:space="preserve">role </w:t>
+      </w:r>
+      <w:proofErr w:type="gramStart"/>
+      <w:r>
+        <w:t>varchar(</w:t>
+      </w:r>
+      <w:proofErr w:type="gramEnd"/>
+      <w:r>
+        <w:t>50)</w:t>
+      </w:r>
+    </w:p>
+    <w:p>
+      <w:r>
+        <w:t>);</w:t>
+      </w:r>
+    </w:p>
+    <w:p>
+      <w:r>
+        <w:t xml:space="preserve">create table </w:t>
+      </w:r>
+      <w:proofErr w:type="spellStart"/>
+      <w:proofErr w:type="gramStart"/>
+      <w:r>
+        <w:t>EventTypes</w:t>
+      </w:r>
+      <w:proofErr w:type="spellEnd"/>
+      <w:r>
+        <w:t>(</w:t>
+      </w:r>
+      <w:proofErr w:type="gramEnd"/>
+    </w:p>
+    <w:p>
+      <w:r>
+        <w:tab/>
+      </w:r>
+      <w:proofErr w:type="spellStart"/>
+      <w:r>
+        <w:t>eventTypeId</w:t>
+      </w:r>
+      <w:proofErr w:type="spellEnd"/>
+      <w:r>
+        <w:t xml:space="preserve"> int </w:t>
+      </w:r>
+      <w:proofErr w:type="gramStart"/>
+      <w:r>
+        <w:t>identity(</w:t>
+      </w:r>
+      <w:proofErr w:type="gramEnd"/>
+      <w:r>
+        <w:t>5000, 1) primary key,</w:t>
+      </w:r>
+    </w:p>
+    <w:p>
+      <w:r>
+        <w:tab/>
+      </w:r>
+      <w:proofErr w:type="spellStart"/>
+      <w:r>
+        <w:t>eventTypeName</w:t>
+      </w:r>
+      <w:proofErr w:type="spellEnd"/>
+      <w:r>
+        <w:t xml:space="preserve"> </w:t>
+      </w:r>
+      <w:proofErr w:type="gramStart"/>
+      <w:r>
+        <w:t>varchar(</w:t>
+      </w:r>
+      <w:proofErr w:type="gramEnd"/>
+      <w:r>
+        <w:t>50) not null</w:t>
+      </w:r>
+    </w:p>
+    <w:p>
+      <w:r>
+        <w:t>);</w:t>
+      </w:r>
+    </w:p>
+    <w:p>
+      <w:r>
+        <w:t xml:space="preserve">create table </w:t>
+      </w:r>
+      <w:proofErr w:type="gramStart"/>
+      <w:r>
+        <w:t>Events(</w:t>
+      </w:r>
+      <w:proofErr w:type="gramEnd"/>
+    </w:p>
+    <w:p>
+      <w:r>
+        <w:tab/>
+      </w:r>
+      <w:proofErr w:type="spellStart"/>
+      <w:r>
+        <w:t>eventId</w:t>
+      </w:r>
+      <w:proofErr w:type="spellEnd"/>
+      <w:r>
+        <w:t xml:space="preserve"> int </w:t>
+      </w:r>
+      <w:proofErr w:type="gramStart"/>
+      <w:r>
+        <w:t>identity(</w:t>
+      </w:r>
+      <w:proofErr w:type="gramEnd"/>
+      <w:r>
+        <w:t>2000, 1) primary key,</w:t>
+      </w:r>
+    </w:p>
+    <w:p>
+      <w:r>
+        <w:tab/>
+      </w:r>
+      <w:proofErr w:type="spellStart"/>
+      <w:r>
+        <w:t>eventName</w:t>
+      </w:r>
+      <w:proofErr w:type="spellEnd"/>
+      <w:r>
+        <w:t xml:space="preserve"> </w:t>
+      </w:r>
+      <w:proofErr w:type="gramStart"/>
+      <w:r>
+        <w:t>varchar(</w:t>
+      </w:r>
+      <w:proofErr w:type="gramEnd"/>
+      <w:r>
+        <w:t>50) not null,</w:t>
+      </w:r>
+    </w:p>
+    <w:p>
+      <w:r>
+        <w:tab/>
+        <w:t xml:space="preserve">description </w:t>
+      </w:r>
+      <w:proofErr w:type="gramStart"/>
+      <w:r>
+        <w:t>varchar(</w:t>
+      </w:r>
+      <w:proofErr w:type="gramEnd"/>
+      <w:r>
+        <w:t>100) not null,</w:t>
+      </w:r>
+    </w:p>
+    <w:p>
+      <w:r>
+        <w:tab/>
+      </w:r>
+      <w:proofErr w:type="spellStart"/>
+      <w:r>
+        <w:t>eventDate</w:t>
+      </w:r>
+      <w:proofErr w:type="spellEnd"/>
+      <w:r>
+        <w:t xml:space="preserve"> </w:t>
+      </w:r>
+      <w:proofErr w:type="gramStart"/>
+      <w:r>
+        <w:t>varchar(</w:t>
+      </w:r>
+      <w:proofErr w:type="gramEnd"/>
+      <w:r>
+        <w:t>11) not null,</w:t>
+      </w:r>
+    </w:p>
+    <w:p>
+      <w:r>
+        <w:tab/>
+        <w:t xml:space="preserve">location </w:t>
+      </w:r>
+      <w:proofErr w:type="gramStart"/>
+      <w:r>
+        <w:t>varchar(</w:t>
+      </w:r>
+      <w:proofErr w:type="gramEnd"/>
+      <w:r>
+        <w:t>100) not null,</w:t>
+      </w:r>
+    </w:p>
+    <w:p>
+      <w:r>
+        <w:tab/>
+      </w:r>
+      <w:proofErr w:type="spellStart"/>
+      <w:r>
+        <w:t>organiserId</w:t>
+      </w:r>
+      <w:proofErr w:type="spellEnd"/>
+      <w:r>
+        <w:t xml:space="preserve"> int,</w:t>
+      </w:r>
+    </w:p>
+    <w:p>
+      <w:r>
+        <w:tab/>
+        <w:t>foreign key(</w:t>
+      </w:r>
+      <w:proofErr w:type="spellStart"/>
+      <w:r>
+        <w:t>organiserId</w:t>
+      </w:r>
+      <w:proofErr w:type="spellEnd"/>
+      <w:r>
+        <w:t>) references Users(</w:t>
+      </w:r>
+      <w:proofErr w:type="spellStart"/>
+      <w:r>
+        <w:t>userId</w:t>
+      </w:r>
+      <w:proofErr w:type="spellEnd"/>
+      <w:r>
+        <w:t>),</w:t>
+      </w:r>
+    </w:p>
+    <w:p>
+      <w:r>
+        <w:tab/>
+      </w:r>
+      <w:proofErr w:type="spellStart"/>
+      <w:r>
+        <w:t>eventTypeId</w:t>
+      </w:r>
+      <w:proofErr w:type="spellEnd"/>
+      <w:r>
+        <w:t xml:space="preserve"> int,</w:t>
+      </w:r>
+    </w:p>
+    <w:p>
+      <w:r>
+        <w:tab/>
+        <w:t>foreign key(</w:t>
+      </w:r>
+      <w:proofErr w:type="spellStart"/>
+      <w:r>
+        <w:t>eventTypeId</w:t>
+      </w:r>
+      <w:proofErr w:type="spellEnd"/>
+      <w:r>
+        <w:t xml:space="preserve">) references </w:t>
+      </w:r>
+      <w:proofErr w:type="spellStart"/>
+      <w:r>
+        <w:t>EventTypes</w:t>
+      </w:r>
+      <w:proofErr w:type="spellEnd"/>
+      <w:r>
+        <w:t>(</w:t>
+      </w:r>
+      <w:proofErr w:type="spellStart"/>
+      <w:r>
+        <w:t>eventTypeId</w:t>
+      </w:r>
+      <w:proofErr w:type="spellEnd"/>
+      <w:r>
+        <w:t>)</w:t>
+      </w:r>
+    </w:p>
+    <w:p>
+      <w:r>
+        <w:t>);</w:t>
+      </w:r>
+    </w:p>
+    <w:p>
+      <w:r>
+        <w:t xml:space="preserve">create table </w:t>
+      </w:r>
+      <w:proofErr w:type="gramStart"/>
+      <w:r>
+        <w:t>Categories(</w:t>
+      </w:r>
+      <w:proofErr w:type="gramEnd"/>
+    </w:p>
+    <w:p>
+      <w:r>
+        <w:tab/>
+      </w:r>
+      <w:proofErr w:type="spellStart"/>
+      <w:r>
+        <w:t>categoryId</w:t>
+      </w:r>
+      <w:proofErr w:type="spellEnd"/>
+      <w:r>
+        <w:t xml:space="preserve"> int </w:t>
+      </w:r>
+      <w:proofErr w:type="gramStart"/>
+      <w:r>
+        <w:t>identity(</w:t>
+      </w:r>
+      <w:proofErr w:type="gramEnd"/>
+      <w:r>
+        <w:t>6000, 1) primary key,</w:t>
+      </w:r>
+    </w:p>
+    <w:p>
+      <w:r>
+        <w:tab/>
+      </w:r>
+      <w:proofErr w:type="spellStart"/>
+      <w:r>
+        <w:t>categoryName</w:t>
+      </w:r>
+      <w:proofErr w:type="spellEnd"/>
+      <w:r>
+        <w:t xml:space="preserve"> </w:t>
+      </w:r>
+      <w:proofErr w:type="gramStart"/>
+      <w:r>
+        <w:t>varchar(</w:t>
+      </w:r>
+      <w:proofErr w:type="gramEnd"/>
+      <w:r>
+        <w:t>100) not null,</w:t>
+      </w:r>
+    </w:p>
+    <w:p>
+      <w:r>
+        <w:tab/>
+      </w:r>
+      <w:proofErr w:type="spellStart"/>
+      <w:r>
+        <w:t>eventId</w:t>
+      </w:r>
+      <w:proofErr w:type="spellEnd"/>
+      <w:r>
+        <w:t xml:space="preserve"> int,</w:t>
+      </w:r>
+    </w:p>
+    <w:p>
+      <w:r>
+        <w:tab/>
+        <w:t>foreign key(</w:t>
+      </w:r>
+      <w:proofErr w:type="spellStart"/>
+      <w:r>
+        <w:t>eventId</w:t>
+      </w:r>
+      <w:proofErr w:type="spellEnd"/>
+      <w:r>
+        <w:t>) references Events(</w:t>
+      </w:r>
+      <w:proofErr w:type="spellStart"/>
+      <w:r>
+        <w:t>eventId</w:t>
+      </w:r>
+      <w:proofErr w:type="spellEnd"/>
+      <w:r>
+        <w:t>)</w:t>
+      </w:r>
+    </w:p>
+    <w:p>
+      <w:r>
+        <w:t>);</w:t>
+      </w:r>
+    </w:p>
+    <w:p>
+      <w:r>
+        <w:t xml:space="preserve">create table </w:t>
+      </w:r>
+      <w:proofErr w:type="gramStart"/>
+      <w:r>
+        <w:t>Enrolments(</w:t>
+      </w:r>
+      <w:proofErr w:type="gramEnd"/>
+    </w:p>
+    <w:p>
+      <w:r>
+        <w:tab/>
+      </w:r>
+      <w:proofErr w:type="spellStart"/>
+      <w:r>
+        <w:t>enrolmentId</w:t>
+      </w:r>
+      <w:proofErr w:type="spellEnd"/>
+      <w:r>
+        <w:t xml:space="preserve"> int </w:t>
+      </w:r>
+      <w:proofErr w:type="gramStart"/>
+      <w:r>
+        <w:t>identity(</w:t>
+      </w:r>
+      <w:proofErr w:type="gramEnd"/>
+      <w:r>
+        <w:t>4000, 1) primary key,</w:t>
+      </w:r>
+    </w:p>
+    <w:p>
+      <w:r>
+        <w:tab/>
+      </w:r>
+      <w:proofErr w:type="spellStart"/>
+      <w:r>
+        <w:t>participentId</w:t>
+      </w:r>
+      <w:proofErr w:type="spellEnd"/>
+      <w:r>
+        <w:t xml:space="preserve"> int,</w:t>
+      </w:r>
+    </w:p>
+    <w:p>
+      <w:r>
+        <w:tab/>
+        <w:t>foreign key(</w:t>
+      </w:r>
+      <w:proofErr w:type="spellStart"/>
+      <w:r>
+        <w:t>participentId</w:t>
+      </w:r>
+      <w:proofErr w:type="spellEnd"/>
+      <w:r>
+        <w:t>) references Users(</w:t>
+      </w:r>
+      <w:proofErr w:type="spellStart"/>
+      <w:r>
+        <w:t>userId</w:t>
+      </w:r>
+      <w:proofErr w:type="spellEnd"/>
+      <w:r>
+        <w:t>),</w:t>
+      </w:r>
+    </w:p>
+    <w:p>
+      <w:r>
+        <w:tab/>
+      </w:r>
+      <w:proofErr w:type="spellStart"/>
+      <w:r>
+        <w:t>eventId</w:t>
+      </w:r>
+      <w:proofErr w:type="spellEnd"/>
+      <w:r>
+        <w:t xml:space="preserve"> int,</w:t>
+      </w:r>
+    </w:p>
+    <w:p>
+      <w:r>
+        <w:tab/>
+        <w:t>foreign key(</w:t>
+      </w:r>
+      <w:proofErr w:type="spellStart"/>
+      <w:r>
+        <w:t>eventId</w:t>
+      </w:r>
+      <w:proofErr w:type="spellEnd"/>
+      <w:r>
+        <w:t>) references Events(</w:t>
+      </w:r>
+      <w:proofErr w:type="spellStart"/>
+      <w:r>
+        <w:t>eventId</w:t>
+      </w:r>
+      <w:proofErr w:type="spellEnd"/>
+      <w:r>
+        <w:t>),</w:t>
+      </w:r>
+    </w:p>
+    <w:p>
+      <w:r>
+        <w:tab/>
+      </w:r>
+      <w:proofErr w:type="spellStart"/>
+      <w:r>
+        <w:t>categoryId</w:t>
+      </w:r>
+      <w:proofErr w:type="spellEnd"/>
+      <w:r>
+        <w:t xml:space="preserve"> int,</w:t>
+      </w:r>
+    </w:p>
+    <w:p>
+      <w:r>
+        <w:tab/>
+        <w:t>foreign key(</w:t>
+      </w:r>
+      <w:proofErr w:type="spellStart"/>
+      <w:r>
+        <w:t>categoryId</w:t>
+      </w:r>
+      <w:proofErr w:type="spellEnd"/>
+      <w:r>
+        <w:t>) references Categories(</w:t>
+      </w:r>
+      <w:proofErr w:type="spellStart"/>
+      <w:r>
+        <w:t>categoryId</w:t>
+      </w:r>
+      <w:proofErr w:type="spellEnd"/>
+      <w:r>
+        <w:t>),</w:t>
+      </w:r>
+    </w:p>
+    <w:p>
+      <w:r>
+        <w:tab/>
+      </w:r>
+      <w:proofErr w:type="spellStart"/>
+      <w:r>
+        <w:t>enrolmentStatus</w:t>
+      </w:r>
+      <w:proofErr w:type="spellEnd"/>
+      <w:r>
+        <w:t xml:space="preserve"> </w:t>
+      </w:r>
+      <w:proofErr w:type="gramStart"/>
+      <w:r>
+        <w:t>varchar(</w:t>
+      </w:r>
+      <w:proofErr w:type="gramEnd"/>
+      <w:r>
+        <w:t>10) not null</w:t>
+      </w:r>
+    </w:p>
+    <w:p>
+      <w:r>
+        <w:t>);</w:t>
+      </w:r>
+    </w:p>
+    <w:p/>
+    <w:p>
+      <w:r>
+        <w:t xml:space="preserve">create table </w:t>
+      </w:r>
+      <w:proofErr w:type="gramStart"/>
+      <w:r>
+        <w:t>Results(</w:t>
+      </w:r>
+      <w:proofErr w:type="gramEnd"/>
+    </w:p>
+    <w:p>
+      <w:r>
+        <w:tab/>
+      </w:r>
+      <w:proofErr w:type="spellStart"/>
+      <w:r>
+        <w:t>resultId</w:t>
+      </w:r>
+      <w:proofErr w:type="spellEnd"/>
+      <w:r>
+        <w:t xml:space="preserve"> int </w:t>
+      </w:r>
+      <w:proofErr w:type="gramStart"/>
+      <w:r>
+        <w:t>identity(</w:t>
+      </w:r>
+      <w:proofErr w:type="gramEnd"/>
+      <w:r>
+        <w:t>1, 1) primary key,</w:t>
+      </w:r>
+    </w:p>
+    <w:p>
+      <w:r>
+        <w:tab/>
+      </w:r>
+      <w:proofErr w:type="spellStart"/>
+      <w:r>
+        <w:t>enrolmentId</w:t>
+      </w:r>
+      <w:proofErr w:type="spellEnd"/>
+      <w:r>
+        <w:t xml:space="preserve"> int unique,</w:t>
+      </w:r>
+    </w:p>
+    <w:p>
+      <w:r>
+        <w:tab/>
+        <w:t>foreign key(</w:t>
+      </w:r>
+      <w:proofErr w:type="spellStart"/>
+      <w:r>
+        <w:t>enrolmentId</w:t>
+      </w:r>
+      <w:proofErr w:type="spellEnd"/>
+      <w:r>
+        <w:t>) references Enrolments(</w:t>
+      </w:r>
+      <w:proofErr w:type="spellStart"/>
+      <w:r>
+        <w:t>enrolmentId</w:t>
+      </w:r>
+      <w:proofErr w:type="spellEnd"/>
+      <w:r>
+        <w:t>),</w:t>
+      </w:r>
+    </w:p>
+    <w:p>
+      <w:r>
+        <w:tab/>
+      </w:r>
+      <w:proofErr w:type="spellStart"/>
+      <w:r>
+        <w:t>finishTime</w:t>
+      </w:r>
+      <w:proofErr w:type="spellEnd"/>
+      <w:r>
+        <w:t xml:space="preserve"> </w:t>
+      </w:r>
+      <w:proofErr w:type="gramStart"/>
+      <w:r>
+        <w:t>varchar(</w:t>
+      </w:r>
+      <w:proofErr w:type="gramEnd"/>
+      <w:r>
+        <w:t>100),</w:t>
+      </w:r>
+    </w:p>
+    <w:p>
+      <w:r>
+        <w:tab/>
+      </w:r>
+      <w:proofErr w:type="spellStart"/>
+      <w:r>
+        <w:t>finishPosition</w:t>
+      </w:r>
+      <w:proofErr w:type="spellEnd"/>
+      <w:r>
+        <w:t xml:space="preserve"> int</w:t>
+      </w:r>
+    </w:p>
+    <w:p>
+      <w:r>
+        <w:t>);</w:t>
+      </w:r>
+    </w:p>
+    <w:p>
+      <w:pPr>
+        <w:pStyle w:val="Heading1"/>
+      </w:pPr>
+      <w:r>
+        <w:t>Sample Data</w:t>
+      </w:r>
+    </w:p>
     <w:p/>
     <w:sectPr>
       <w:pgSz w:w="11906" w:h="16838"/>
@@ -2437,6 +3226,7 @@
   <w:style w:type="character" w:default="1" w:styleId="DefaultParagraphFont">
     <w:name w:val="Default Paragraph Font"/>
     <w:uiPriority w:val="1"/>
+    <w:semiHidden/>
     <w:unhideWhenUsed/>
   </w:style>
   <w:style w:type="table" w:default="1" w:styleId="TableNormal">

</xml_diff>

<commit_message>
Added sql database changes to word document
</commit_message>
<xml_diff>
--- a/Documents/Race Day Plan.docx
+++ b/Documents/Race Day Plan.docx
@@ -1948,7 +1948,7 @@
       </w:r>
       <w:proofErr w:type="gramEnd"/>
       <w:r>
-        <w:t>100) not null,</w:t>
+        <w:t>100) not null unique,</w:t>
       </w:r>
     </w:p>
     <w:p>
@@ -1962,7 +1962,7 @@
       </w:r>
       <w:proofErr w:type="gramEnd"/>
       <w:r>
-        <w:t>100),</w:t>
+        <w:t>100) not null,</w:t>
       </w:r>
     </w:p>
     <w:p>
@@ -1976,7 +1976,7 @@
       </w:r>
       <w:proofErr w:type="gramEnd"/>
       <w:r>
-        <w:t>50),</w:t>
+        <w:t>50) not null unique,</w:t>
       </w:r>
     </w:p>
     <w:p>
@@ -1990,7 +1990,7 @@
       </w:r>
       <w:proofErr w:type="gramEnd"/>
       <w:r>
-        <w:t>50)</w:t>
+        <w:t>50) not null</w:t>
       </w:r>
     </w:p>
     <w:p>
@@ -1998,6 +1998,7 @@
         <w:t>);</w:t>
       </w:r>
     </w:p>
+    <w:p/>
     <w:p>
       <w:r>
         <w:t xml:space="preserve">create table </w:t>
@@ -2060,6 +2061,7 @@
         <w:t>);</w:t>
       </w:r>
     </w:p>
+    <w:p/>
     <w:p>
       <w:r>
         <w:t xml:space="preserve">create table </w:t>
@@ -2136,15 +2138,7 @@
       </w:r>
       <w:proofErr w:type="spellEnd"/>
       <w:r>
-        <w:t xml:space="preserve"> </w:t>
-      </w:r>
-      <w:proofErr w:type="gramStart"/>
-      <w:r>
-        <w:t>varchar(</w:t>
-      </w:r>
-      <w:proofErr w:type="gramEnd"/>
-      <w:r>
-        <w:t>11) not null,</w:t>
+        <w:t xml:space="preserve"> date not null,</w:t>
       </w:r>
     </w:p>
     <w:p>
@@ -2171,7 +2165,7 @@
       </w:r>
       <w:proofErr w:type="spellEnd"/>
       <w:r>
-        <w:t xml:space="preserve"> int,</w:t>
+        <w:t xml:space="preserve"> int not null,</w:t>
       </w:r>
     </w:p>
     <w:p>
@@ -2206,7 +2200,7 @@
       </w:r>
       <w:proofErr w:type="spellEnd"/>
       <w:r>
-        <w:t xml:space="preserve"> int,</w:t>
+        <w:t xml:space="preserve"> int not null,</w:t>
       </w:r>
     </w:p>
     <w:p>
@@ -2244,6 +2238,7 @@
         <w:t>);</w:t>
       </w:r>
     </w:p>
+    <w:p/>
     <w:p>
       <w:r>
         <w:t xml:space="preserve">create table </w:t>
@@ -2306,7 +2301,7 @@
       </w:r>
       <w:proofErr w:type="spellEnd"/>
       <w:r>
-        <w:t xml:space="preserve"> int,</w:t>
+        <w:t xml:space="preserve"> int not null,</w:t>
       </w:r>
     </w:p>
     <w:p>
@@ -2336,6 +2331,7 @@
         <w:t>);</w:t>
       </w:r>
     </w:p>
+    <w:p/>
     <w:p>
       <w:r>
         <w:t xml:space="preserve">create table </w:t>
@@ -2373,11 +2369,11 @@
       </w:r>
       <w:proofErr w:type="spellStart"/>
       <w:r>
-        <w:t>participentId</w:t>
-      </w:r>
-      <w:proofErr w:type="spellEnd"/>
-      <w:r>
-        <w:t xml:space="preserve"> int,</w:t>
+        <w:t>participantId</w:t>
+      </w:r>
+      <w:proofErr w:type="spellEnd"/>
+      <w:r>
+        <w:t xml:space="preserve"> int not null,</w:t>
       </w:r>
     </w:p>
     <w:p>
@@ -2387,7 +2383,7 @@
       </w:r>
       <w:proofErr w:type="spellStart"/>
       <w:r>
-        <w:t>participentId</w:t>
+        <w:t>participantId</w:t>
       </w:r>
       <w:proofErr w:type="spellEnd"/>
       <w:r>
@@ -2499,6 +2495,7 @@
       </w:r>
     </w:p>
     <w:p/>
+    <w:p/>
     <w:p>
       <w:r>
         <w:t xml:space="preserve">create table </w:t>
@@ -2575,15 +2572,7 @@
       </w:r>
       <w:proofErr w:type="spellEnd"/>
       <w:r>
-        <w:t xml:space="preserve"> </w:t>
-      </w:r>
-      <w:proofErr w:type="gramStart"/>
-      <w:r>
-        <w:t>varchar(</w:t>
-      </w:r>
-      <w:proofErr w:type="gramEnd"/>
-      <w:r>
-        <w:t>100),</w:t>
+        <w:t xml:space="preserve"> time not null,</w:t>
       </w:r>
     </w:p>
     <w:p>
@@ -2596,20 +2585,12 @@
       </w:r>
       <w:proofErr w:type="spellEnd"/>
       <w:r>
-        <w:t xml:space="preserve"> int</w:t>
+        <w:t xml:space="preserve"> int not null</w:t>
       </w:r>
     </w:p>
     <w:p>
       <w:r>
         <w:t>);</w:t>
-      </w:r>
-    </w:p>
-    <w:p>
-      <w:pPr>
-        <w:pStyle w:val="Heading1"/>
-      </w:pPr>
-      <w:r>
-        <w:t>Sample Data</w:t>
       </w:r>
     </w:p>
     <w:p/>
@@ -3226,7 +3207,6 @@
   <w:style w:type="character" w:default="1" w:styleId="DefaultParagraphFont">
     <w:name w:val="Default Paragraph Font"/>
     <w:uiPriority w:val="1"/>
-    <w:semiHidden/>
     <w:unhideWhenUsed/>
   </w:style>
   <w:style w:type="table" w:default="1" w:styleId="TableNormal">

</xml_diff>

<commit_message>
Added sql code for adding sample data to the plan
</commit_message>
<xml_diff>
--- a/Documents/Race Day Plan.docx
+++ b/Documents/Race Day Plan.docx
@@ -2591,6 +2591,320 @@
     <w:p>
       <w:r>
         <w:t>);</w:t>
+      </w:r>
+    </w:p>
+    <w:p>
+      <w:pPr>
+        <w:pStyle w:val="Heading1"/>
+      </w:pPr>
+      <w:r>
+        <w:t>Sample Data</w:t>
+      </w:r>
+    </w:p>
+    <w:p>
+      <w:r>
+        <w:t xml:space="preserve">insert into </w:t>
+      </w:r>
+      <w:proofErr w:type="gramStart"/>
+      <w:r>
+        <w:t>Users(</w:t>
+      </w:r>
+      <w:proofErr w:type="spellStart"/>
+      <w:proofErr w:type="gramEnd"/>
+      <w:r>
+        <w:t>firstName</w:t>
+      </w:r>
+      <w:proofErr w:type="spellEnd"/>
+      <w:r>
+        <w:t xml:space="preserve">, </w:t>
+      </w:r>
+      <w:proofErr w:type="spellStart"/>
+      <w:r>
+        <w:t>lastName</w:t>
+      </w:r>
+      <w:proofErr w:type="spellEnd"/>
+      <w:r>
+        <w:t xml:space="preserve">, username, </w:t>
+      </w:r>
+      <w:proofErr w:type="spellStart"/>
+      <w:r>
+        <w:t>emailAddress</w:t>
+      </w:r>
+      <w:proofErr w:type="spellEnd"/>
+      <w:r>
+        <w:t>, password, role)</w:t>
+      </w:r>
+    </w:p>
+    <w:p>
+      <w:r>
+        <w:t>values</w:t>
+      </w:r>
+      <w:r>
+        <w:tab/>
+        <w:t>('Esethu', 'Busakwe', 'esethu@gmail.com', 'HASHED_PASSWORD1', '</w:t>
+      </w:r>
+      <w:proofErr w:type="spellStart"/>
+      <w:r>
+        <w:t>esethub</w:t>
+      </w:r>
+      <w:proofErr w:type="spellEnd"/>
+      <w:r>
+        <w:t xml:space="preserve">', 'Organiser'), </w:t>
+      </w:r>
+    </w:p>
+    <w:p>
+      <w:r>
+        <w:tab/>
+        <w:t>('John','Mokoena</w:t>
+      </w:r>
+      <w:proofErr w:type="gramStart"/>
+      <w:r>
+        <w:t>','john@gmail.com</w:t>
+      </w:r>
+      <w:proofErr w:type="gramEnd"/>
+      <w:r>
+        <w:t>','HASHED_PASSWORD2','johnm','Organiser'),</w:t>
+      </w:r>
+    </w:p>
+    <w:p>
+      <w:r>
+        <w:tab/>
+        <w:t>('Walter','White</w:t>
+      </w:r>
+      <w:proofErr w:type="gramStart"/>
+      <w:r>
+        <w:t>','walterw@gmail.com</w:t>
+      </w:r>
+      <w:proofErr w:type="gramEnd"/>
+      <w:r>
+        <w:t>','HASHED_PASSWORD3','wwhite','Participant'),</w:t>
+      </w:r>
+    </w:p>
+    <w:p>
+      <w:r>
+        <w:tab/>
+        <w:t>('Marty','Byrd</w:t>
+      </w:r>
+      <w:proofErr w:type="gramStart"/>
+      <w:r>
+        <w:t>','martybyrd@gmail.com</w:t>
+      </w:r>
+      <w:proofErr w:type="gramEnd"/>
+      <w:r>
+        <w:t>','HASHED_PASSWORD4','byrdm','Participant');</w:t>
+      </w:r>
+    </w:p>
+    <w:p/>
+    <w:p>
+      <w:r>
+        <w:t xml:space="preserve">insert into </w:t>
+      </w:r>
+      <w:proofErr w:type="spellStart"/>
+      <w:r>
+        <w:t>EventTypes</w:t>
+      </w:r>
+      <w:proofErr w:type="spellEnd"/>
+      <w:r>
+        <w:t>(</w:t>
+      </w:r>
+      <w:proofErr w:type="spellStart"/>
+      <w:r>
+        <w:t>eventTypeName</w:t>
+      </w:r>
+      <w:proofErr w:type="spellEnd"/>
+      <w:r>
+        <w:t>)</w:t>
+      </w:r>
+    </w:p>
+    <w:p>
+      <w:r>
+        <w:t>values</w:t>
+      </w:r>
+      <w:r>
+        <w:tab/>
+        <w:t>('Run'), ('Swimming'), ('Cycling'), ('Walk');</w:t>
+      </w:r>
+    </w:p>
+    <w:p/>
+    <w:p>
+      <w:r>
+        <w:t xml:space="preserve">insert into </w:t>
+      </w:r>
+      <w:proofErr w:type="gramStart"/>
+      <w:r>
+        <w:t>Events(</w:t>
+      </w:r>
+      <w:proofErr w:type="spellStart"/>
+      <w:proofErr w:type="gramEnd"/>
+      <w:r>
+        <w:t>eventName</w:t>
+      </w:r>
+      <w:proofErr w:type="spellEnd"/>
+      <w:r>
+        <w:t xml:space="preserve">, description, </w:t>
+      </w:r>
+      <w:proofErr w:type="spellStart"/>
+      <w:r>
+        <w:t>eventDate</w:t>
+      </w:r>
+      <w:proofErr w:type="spellEnd"/>
+      <w:r>
+        <w:t xml:space="preserve">, location, </w:t>
+      </w:r>
+      <w:proofErr w:type="spellStart"/>
+      <w:r>
+        <w:t>organiserId</w:t>
+      </w:r>
+      <w:proofErr w:type="spellEnd"/>
+      <w:r>
+        <w:t xml:space="preserve">, </w:t>
+      </w:r>
+      <w:proofErr w:type="spellStart"/>
+      <w:r>
+        <w:t>eventTypeId</w:t>
+      </w:r>
+      <w:proofErr w:type="spellEnd"/>
+      <w:r>
+        <w:t>)</w:t>
+      </w:r>
+    </w:p>
+    <w:p>
+      <w:r>
+        <w:t>values</w:t>
+      </w:r>
+      <w:r>
+        <w:tab/>
+        <w:t>('Run Jozi', '100km marathon', '2026-10-09', 'Ghandi Square', 1000, 5000),</w:t>
+      </w:r>
+    </w:p>
+    <w:p>
+      <w:r>
+        <w:tab/>
+      </w:r>
+      <w:r>
+        <w:t>('Swim Meet', '10Km swim', '2026-9-10', 'Richards Bay', 1001, 5001),</w:t>
+      </w:r>
+    </w:p>
+    <w:p>
+      <w:pPr>
+        <w:rPr>
+          <w:lang w:val="nl-NL"/>
+        </w:rPr>
+      </w:pPr>
+      <w:r>
+        <w:tab/>
+      </w:r>
+      <w:r>
+        <w:rPr>
+          <w:lang w:val="nl-NL"/>
+        </w:rPr>
+        <w:t>('Tour de Jozi', '150km race', '2026-10-20', 'Braamfontein', 1000, 5002)</w:t>
+      </w:r>
+    </w:p>
+    <w:p>
+      <w:pPr>
+        <w:rPr>
+          <w:lang w:val="nl-NL"/>
+        </w:rPr>
+      </w:pPr>
+    </w:p>
+    <w:p>
+      <w:r>
+        <w:t xml:space="preserve">insert into </w:t>
+      </w:r>
+      <w:proofErr w:type="gramStart"/>
+      <w:r>
+        <w:t>Categories(</w:t>
+      </w:r>
+      <w:proofErr w:type="spellStart"/>
+      <w:proofErr w:type="gramEnd"/>
+      <w:r>
+        <w:t>categoryName</w:t>
+      </w:r>
+      <w:proofErr w:type="spellEnd"/>
+      <w:r>
+        <w:t xml:space="preserve">, </w:t>
+      </w:r>
+      <w:proofErr w:type="spellStart"/>
+      <w:r>
+        <w:t>eventId</w:t>
+      </w:r>
+      <w:proofErr w:type="spellEnd"/>
+      <w:r>
+        <w:t>)</w:t>
+      </w:r>
+    </w:p>
+    <w:p>
+      <w:r>
+        <w:t>values</w:t>
+      </w:r>
+      <w:r>
+        <w:tab/>
+        <w:t>('100Km', 2002),</w:t>
+      </w:r>
+    </w:p>
+    <w:p>
+      <w:r>
+        <w:tab/>
+        <w:t>('10Km', 2003);</w:t>
+      </w:r>
+    </w:p>
+    <w:p/>
+    <w:p>
+      <w:r>
+        <w:t xml:space="preserve">insert into </w:t>
+      </w:r>
+      <w:proofErr w:type="gramStart"/>
+      <w:r>
+        <w:t>Enrolments(</w:t>
+      </w:r>
+      <w:proofErr w:type="spellStart"/>
+      <w:proofErr w:type="gramEnd"/>
+      <w:r>
+        <w:t>participantId</w:t>
+      </w:r>
+      <w:proofErr w:type="spellEnd"/>
+      <w:r>
+        <w:t xml:space="preserve">, </w:t>
+      </w:r>
+      <w:proofErr w:type="spellStart"/>
+      <w:r>
+        <w:t>eventId</w:t>
+      </w:r>
+      <w:proofErr w:type="spellEnd"/>
+      <w:r>
+        <w:t xml:space="preserve">, </w:t>
+      </w:r>
+      <w:proofErr w:type="spellStart"/>
+      <w:r>
+        <w:t>categoryId</w:t>
+      </w:r>
+      <w:proofErr w:type="spellEnd"/>
+      <w:r>
+        <w:t xml:space="preserve">, </w:t>
+      </w:r>
+      <w:proofErr w:type="spellStart"/>
+      <w:r>
+        <w:t>enrolmentStatus</w:t>
+      </w:r>
+      <w:proofErr w:type="spellEnd"/>
+      <w:r>
+        <w:t>)</w:t>
+      </w:r>
+    </w:p>
+    <w:p>
+      <w:r>
+        <w:t>values</w:t>
+      </w:r>
+      <w:r>
+        <w:tab/>
+        <w:t>(1002, 2002, 6000, 'Enrolled'),</w:t>
+      </w:r>
+    </w:p>
+    <w:p>
+      <w:r>
+        <w:tab/>
+        <w:t>(1003, 2003, 6001, 'Enrolled');</w:t>
       </w:r>
     </w:p>
     <w:p/>

</xml_diff>